<commit_message>
add: header and footer
added components and basic content in header
</commit_message>
<xml_diff>
--- a/Opgavebeskrivelse - din mægler.docx
+++ b/Opgavebeskrivelse - din mægler.docx
@@ -1,6 +1,6 @@
 
 <file path=word/document.xml><?xml version="1.0" encoding="utf-8"?>
-<w:document xmlns:wpc="http://schemas.microsoft.com/office/word/2010/wordprocessingCanvas" xmlns:cx="http://schemas.microsoft.com/office/drawing/2014/chartex" xmlns:cx1="http://schemas.microsoft.com/office/drawing/2015/9/8/chartex" xmlns:mc="http://schemas.openxmlformats.org/markup-compatibility/2006" xmlns:o="urn:schemas-microsoft-com:office:office" xmlns:r="http://schemas.openxmlformats.org/officeDocument/2006/relationships" xmlns:m="http://schemas.openxmlformats.org/officeDocument/2006/math" xmlns:v="urn:schemas-microsoft-com:vml" xmlns:wp14="http://schemas.microsoft.com/office/word/2010/wordprocessingDrawing" xmlns:wp="http://schemas.openxmlformats.org/drawingml/2006/wordprocessingDrawing" xmlns:w10="urn:schemas-microsoft-com:office:word" xmlns:w="http://schemas.openxmlformats.org/wordprocessingml/2006/main" xmlns:w14="http://schemas.microsoft.com/office/word/2010/wordml" xmlns:w15="http://schemas.microsoft.com/office/word/2012/wordml" xmlns:w16se="http://schemas.microsoft.com/office/word/2015/wordml/symex" xmlns:wpg="http://schemas.microsoft.com/office/word/2010/wordprocessingGroup" xmlns:wpi="http://schemas.microsoft.com/office/word/2010/wordprocessingInk" xmlns:wne="http://schemas.microsoft.com/office/word/2006/wordml" xmlns:wps="http://schemas.microsoft.com/office/word/2010/wordprocessingShape" mc:Ignorable="w14 w15 w16se wp14">
+<w:document xmlns:wpc="http://schemas.microsoft.com/office/word/2010/wordprocessingCanvas" xmlns:cx="http://schemas.microsoft.com/office/drawing/2014/chartex" xmlns:cx1="http://schemas.microsoft.com/office/drawing/2015/9/8/chartex" xmlns:cx2="http://schemas.microsoft.com/office/drawing/2015/10/21/chartex" xmlns:cx3="http://schemas.microsoft.com/office/drawing/2016/5/9/chartex" xmlns:cx4="http://schemas.microsoft.com/office/drawing/2016/5/10/chartex" xmlns:cx5="http://schemas.microsoft.com/office/drawing/2016/5/11/chartex" xmlns:cx6="http://schemas.microsoft.com/office/drawing/2016/5/12/chartex" xmlns:cx7="http://schemas.microsoft.com/office/drawing/2016/5/13/chartex" xmlns:cx8="http://schemas.microsoft.com/office/drawing/2016/5/14/chartex" xmlns:mc="http://schemas.openxmlformats.org/markup-compatibility/2006" xmlns:aink="http://schemas.microsoft.com/office/drawing/2016/ink" xmlns:am3d="http://schemas.microsoft.com/office/drawing/2017/model3d" xmlns:o="urn:schemas-microsoft-com:office:office" xmlns:oel="http://schemas.microsoft.com/office/2019/extlst" xmlns:r="http://schemas.openxmlformats.org/officeDocument/2006/relationships" xmlns:m="http://schemas.openxmlformats.org/officeDocument/2006/math" xmlns:v="urn:schemas-microsoft-com:vml" xmlns:wp14="http://schemas.microsoft.com/office/word/2010/wordprocessingDrawing" xmlns:wp="http://schemas.openxmlformats.org/drawingml/2006/wordprocessingDrawing" xmlns:w10="urn:schemas-microsoft-com:office:word" xmlns:w="http://schemas.openxmlformats.org/wordprocessingml/2006/main" xmlns:w14="http://schemas.microsoft.com/office/word/2010/wordml" xmlns:w15="http://schemas.microsoft.com/office/word/2012/wordml" xmlns:w16cex="http://schemas.microsoft.com/office/word/2018/wordml/cex" xmlns:w16cid="http://schemas.microsoft.com/office/word/2016/wordml/cid" xmlns:w16="http://schemas.microsoft.com/office/word/2018/wordml" xmlns:w16du="http://schemas.microsoft.com/office/word/2023/wordml/word16du" xmlns:w16sdtdh="http://schemas.microsoft.com/office/word/2020/wordml/sdtdatahash" xmlns:w16sdtfl="http://schemas.microsoft.com/office/word/2024/wordml/sdtformatlock" xmlns:w16se="http://schemas.microsoft.com/office/word/2015/wordml/symex" xmlns:wpg="http://schemas.microsoft.com/office/word/2010/wordprocessingGroup" xmlns:wpi="http://schemas.microsoft.com/office/word/2010/wordprocessingInk" xmlns:wne="http://schemas.microsoft.com/office/word/2006/wordml" xmlns:wps="http://schemas.microsoft.com/office/word/2010/wordprocessingShape" mc:Ignorable="w14 w15 w16se w16cid w16 w16cex w16sdtdh w16sdtfl w16du wp14">
   <w:body>
     <w:p>
       <w:pPr>
@@ -252,15 +252,7 @@
           <w:rFonts w:cstheme="minorHAnsi"/>
           <w:color w:val="000000"/>
         </w:rPr>
-        <w:t xml:space="preserve">gerne anvende </w:t>
-      </w:r>
-      <w:proofErr w:type="spellStart"/>
-      <w:r>
-        <w:rPr>
-          <w:rFonts w:cstheme="minorHAnsi"/>
-          <w:color w:val="000000"/>
-        </w:rPr>
-        <w:t>framework</w:t>
+        <w:t>gerne anvende framework</w:t>
       </w:r>
       <w:r>
         <w:rPr>
@@ -269,7 +261,6 @@
         </w:rPr>
         <w:t>s</w:t>
       </w:r>
-      <w:proofErr w:type="spellEnd"/>
       <w:r>
         <w:rPr>
           <w:rFonts w:cstheme="minorHAnsi"/>
@@ -433,13 +424,7 @@
         <w:rPr>
           <w:rFonts w:cstheme="minorHAnsi"/>
         </w:rPr>
-        <w:t>tdokumentation</w:t>
-      </w:r>
-      <w:r>
-        <w:rPr>
-          <w:rFonts w:cstheme="minorHAnsi"/>
-        </w:rPr>
-        <w:t xml:space="preserve">en </w:t>
+        <w:t xml:space="preserve">tdokumentationen </w:t>
       </w:r>
       <w:r>
         <w:rPr>
@@ -586,26 +571,28 @@
       <w:pPr>
         <w:pStyle w:val="Listeafsnit"/>
         <w:numPr>
-          <w:ilvl w:val="0"/>
+          <w:ilvl w:val="1"/>
           <w:numId w:val="3"/>
         </w:numPr>
-        <w:rPr>
-          <w:rFonts w:cstheme="minorHAnsi"/>
-        </w:rPr>
-      </w:pPr>
-      <w:r>
-        <w:rPr>
-          <w:rFonts w:cstheme="minorHAnsi"/>
-          <w:i/>
-          <w:iCs/>
-        </w:rPr>
-        <w:t xml:space="preserve">Argumentation </w:t>
-      </w:r>
-      <w:r>
-        <w:rPr>
-          <w:rFonts w:cstheme="minorHAnsi"/>
-        </w:rPr>
-        <w:t>for de valg du har truffet under løsningen af opgaven.</w:t>
+      </w:pPr>
+      <w:r>
+        <w:t xml:space="preserve">Hvis noget kode er taget fra </w:t>
+      </w:r>
+      <w:proofErr w:type="spellStart"/>
+      <w:r>
+        <w:t>stackoverflow</w:t>
+      </w:r>
+      <w:proofErr w:type="spellEnd"/>
+      <w:r>
+        <w:t xml:space="preserve">, </w:t>
+      </w:r>
+      <w:proofErr w:type="spellStart"/>
+      <w:r>
+        <w:t>chatgpt</w:t>
+      </w:r>
+      <w:proofErr w:type="spellEnd"/>
+      <w:r>
+        <w:t xml:space="preserve"> har genereret det eller noget tredje, så skal det dokumenteres hvor den del af koden er kommet fra. Link til hvor koden er taget fra eller noget.</w:t>
       </w:r>
     </w:p>
     <w:p>
@@ -625,25 +612,13 @@
           <w:i/>
           <w:iCs/>
         </w:rPr>
-        <w:t xml:space="preserve">Vurdering </w:t>
-      </w:r>
-      <w:r>
-        <w:rPr>
-          <w:rFonts w:cstheme="minorHAnsi"/>
-        </w:rPr>
-        <w:t xml:space="preserve">af din egen indsats og gennemførelse af </w:t>
-      </w:r>
-      <w:r>
-        <w:rPr>
-          <w:rFonts w:cstheme="minorHAnsi"/>
-        </w:rPr>
-        <w:t>opgaven (hvad gik godt / skidt)</w:t>
-      </w:r>
-      <w:r>
-        <w:rPr>
-          <w:rFonts w:cstheme="minorHAnsi"/>
-        </w:rPr>
-        <w:t>.</w:t>
+        <w:t xml:space="preserve">Argumentation </w:t>
+      </w:r>
+      <w:r>
+        <w:rPr>
+          <w:rFonts w:cstheme="minorHAnsi"/>
+        </w:rPr>
+        <w:t>for de valg du har truffet under løsningen af opgaven.</w:t>
       </w:r>
     </w:p>
     <w:p>
@@ -663,171 +638,25 @@
           <w:i/>
           <w:iCs/>
         </w:rPr>
-        <w:t xml:space="preserve">Fremhævelse </w:t>
-      </w:r>
-      <w:r>
-        <w:rPr>
-          <w:rFonts w:cstheme="minorHAnsi"/>
-        </w:rPr>
-        <w:t>af eventuelle særlige punkter til bedømmelse.</w:t>
-      </w:r>
-    </w:p>
-    <w:p>
-      <w:pPr>
-        <w:rPr>
-          <w:rFonts w:cstheme="minorHAnsi"/>
-        </w:rPr>
-      </w:pPr>
-      <w:r>
-        <w:rPr>
-          <w:rFonts w:cstheme="minorHAnsi"/>
-        </w:rPr>
-        <w:t>Hvis du bruger et projektstyrings</w:t>
-      </w:r>
-      <w:r>
-        <w:rPr>
-          <w:rFonts w:cstheme="minorHAnsi"/>
-        </w:rPr>
-        <w:t xml:space="preserve"> </w:t>
-      </w:r>
-      <w:r>
-        <w:rPr>
-          <w:rFonts w:cstheme="minorHAnsi"/>
-        </w:rPr>
-        <w:t>værktøj</w:t>
-      </w:r>
-      <w:r>
-        <w:rPr>
-          <w:rFonts w:cstheme="minorHAnsi"/>
-        </w:rPr>
-        <w:t xml:space="preserve"> som ikke er </w:t>
-      </w:r>
-      <w:proofErr w:type="spellStart"/>
-      <w:r>
-        <w:rPr>
-          <w:rFonts w:cstheme="minorHAnsi"/>
-        </w:rPr>
-        <w:t>github</w:t>
-      </w:r>
-      <w:proofErr w:type="spellEnd"/>
-      <w:r>
-        <w:rPr>
-          <w:rFonts w:cstheme="minorHAnsi"/>
-        </w:rPr>
-        <w:t xml:space="preserve"> </w:t>
-      </w:r>
-      <w:proofErr w:type="spellStart"/>
-      <w:r>
-        <w:rPr>
-          <w:rFonts w:cstheme="minorHAnsi"/>
-        </w:rPr>
-        <w:t>projects</w:t>
-      </w:r>
-      <w:proofErr w:type="spellEnd"/>
-      <w:r>
-        <w:rPr>
-          <w:rFonts w:cstheme="minorHAnsi"/>
-        </w:rPr>
-        <w:t xml:space="preserve"> (</w:t>
-      </w:r>
-      <w:proofErr w:type="spellStart"/>
-      <w:r>
-        <w:rPr>
-          <w:rFonts w:cstheme="minorHAnsi"/>
-        </w:rPr>
-        <w:t>Trello</w:t>
-      </w:r>
-      <w:proofErr w:type="spellEnd"/>
-      <w:r>
-        <w:rPr>
-          <w:rFonts w:cstheme="minorHAnsi"/>
-        </w:rPr>
-        <w:t xml:space="preserve"> eller lign.) kan du med</w:t>
-      </w:r>
-      <w:r>
-        <w:rPr>
-          <w:rFonts w:cstheme="minorHAnsi"/>
-        </w:rPr>
-        <w:t xml:space="preserve"> </w:t>
-      </w:r>
-      <w:r>
-        <w:rPr>
-          <w:rFonts w:cstheme="minorHAnsi"/>
-        </w:rPr>
-        <w:t>fordel indsætte et link til dit projekt i rapporten.</w:t>
-      </w:r>
-      <w:r>
-        <w:rPr>
-          <w:rFonts w:cstheme="minorHAnsi"/>
-        </w:rPr>
-        <w:t xml:space="preserve"> Du kan også med fordel indsætte daglige </w:t>
-      </w:r>
-      <w:proofErr w:type="spellStart"/>
-      <w:r>
-        <w:rPr>
-          <w:rFonts w:cstheme="minorHAnsi"/>
-        </w:rPr>
-        <w:t>screenshots</w:t>
-      </w:r>
-      <w:proofErr w:type="spellEnd"/>
-      <w:r>
-        <w:rPr>
-          <w:rFonts w:cstheme="minorHAnsi"/>
-        </w:rPr>
-        <w:t xml:space="preserve"> af dit </w:t>
-      </w:r>
-      <w:proofErr w:type="spellStart"/>
-      <w:r>
-        <w:rPr>
-          <w:rFonts w:cstheme="minorHAnsi"/>
-        </w:rPr>
-        <w:t>github</w:t>
-      </w:r>
-      <w:proofErr w:type="spellEnd"/>
-      <w:r>
-        <w:rPr>
-          <w:rFonts w:cstheme="minorHAnsi"/>
-        </w:rPr>
-        <w:t xml:space="preserve"> </w:t>
-      </w:r>
-      <w:proofErr w:type="spellStart"/>
-      <w:r>
-        <w:rPr>
-          <w:rFonts w:cstheme="minorHAnsi"/>
-        </w:rPr>
-        <w:t>projects</w:t>
-      </w:r>
-      <w:proofErr w:type="spellEnd"/>
-      <w:r>
-        <w:rPr>
-          <w:rFonts w:cstheme="minorHAnsi"/>
-        </w:rPr>
-        <w:t xml:space="preserve"> eller </w:t>
-      </w:r>
-      <w:proofErr w:type="spellStart"/>
-      <w:r>
-        <w:rPr>
-          <w:rFonts w:cstheme="minorHAnsi"/>
-        </w:rPr>
-        <w:t>trello-board</w:t>
-      </w:r>
-      <w:proofErr w:type="spellEnd"/>
-      <w:r>
-        <w:rPr>
-          <w:rFonts w:cstheme="minorHAnsi"/>
-        </w:rPr>
-        <w:t>, som kan vise din progression i arbejdet.</w:t>
-      </w:r>
-    </w:p>
-    <w:p>
-      <w:pPr>
-        <w:pStyle w:val="Overskrift3"/>
-      </w:pPr>
-      <w:r>
-        <w:t>Øverst i</w:t>
-      </w:r>
-      <w:r>
-        <w:t xml:space="preserve"> rapporten skal fremgå:</w:t>
+        <w:t xml:space="preserve">Vurdering </w:t>
+      </w:r>
+      <w:r>
+        <w:rPr>
+          <w:rFonts w:cstheme="minorHAnsi"/>
+        </w:rPr>
+        <w:t xml:space="preserve">af din egen indsats og gennemførelse af </w:t>
+      </w:r>
+      <w:r>
+        <w:rPr>
+          <w:rFonts w:cstheme="minorHAnsi"/>
+        </w:rPr>
+        <w:t>opgaven (hvad gik godt / skidt)</w:t>
+      </w:r>
+      <w:r>
+        <w:rPr>
+          <w:rFonts w:cstheme="minorHAnsi"/>
+        </w:rPr>
+        <w:t>.</w:t>
       </w:r>
     </w:p>
     <w:p>
@@ -844,8 +673,160 @@
       <w:r>
         <w:rPr>
           <w:rFonts w:cstheme="minorHAnsi"/>
-        </w:rPr>
-        <w:t>Opgavens navn samt dit navn og holdnummer</w:t>
+          <w:i/>
+          <w:iCs/>
+        </w:rPr>
+        <w:t xml:space="preserve">Fremhævelse </w:t>
+      </w:r>
+      <w:r>
+        <w:rPr>
+          <w:rFonts w:cstheme="minorHAnsi"/>
+        </w:rPr>
+        <w:t>af eventuelle særlige punkter til bedømmelse.</w:t>
+      </w:r>
+    </w:p>
+    <w:p>
+      <w:pPr>
+        <w:rPr>
+          <w:rFonts w:cstheme="minorHAnsi"/>
+        </w:rPr>
+      </w:pPr>
+      <w:r>
+        <w:rPr>
+          <w:rFonts w:cstheme="minorHAnsi"/>
+        </w:rPr>
+        <w:t>Hvis du bruger et projektstyrings</w:t>
+      </w:r>
+      <w:r>
+        <w:rPr>
+          <w:rFonts w:cstheme="minorHAnsi"/>
+        </w:rPr>
+        <w:t xml:space="preserve"> </w:t>
+      </w:r>
+      <w:r>
+        <w:rPr>
+          <w:rFonts w:cstheme="minorHAnsi"/>
+        </w:rPr>
+        <w:t>værktøj</w:t>
+      </w:r>
+      <w:r>
+        <w:rPr>
+          <w:rFonts w:cstheme="minorHAnsi"/>
+        </w:rPr>
+        <w:t xml:space="preserve"> som ikke er </w:t>
+      </w:r>
+      <w:proofErr w:type="spellStart"/>
+      <w:r>
+        <w:rPr>
+          <w:rFonts w:cstheme="minorHAnsi"/>
+        </w:rPr>
+        <w:t>github</w:t>
+      </w:r>
+      <w:proofErr w:type="spellEnd"/>
+      <w:r>
+        <w:rPr>
+          <w:rFonts w:cstheme="minorHAnsi"/>
+        </w:rPr>
+        <w:t xml:space="preserve"> </w:t>
+      </w:r>
+      <w:proofErr w:type="spellStart"/>
+      <w:r>
+        <w:rPr>
+          <w:rFonts w:cstheme="minorHAnsi"/>
+        </w:rPr>
+        <w:t>projects</w:t>
+      </w:r>
+      <w:proofErr w:type="spellEnd"/>
+      <w:r>
+        <w:rPr>
+          <w:rFonts w:cstheme="minorHAnsi"/>
+        </w:rPr>
+        <w:t xml:space="preserve"> (</w:t>
+      </w:r>
+      <w:proofErr w:type="spellStart"/>
+      <w:r>
+        <w:rPr>
+          <w:rFonts w:cstheme="minorHAnsi"/>
+        </w:rPr>
+        <w:t>Trello</w:t>
+      </w:r>
+      <w:proofErr w:type="spellEnd"/>
+      <w:r>
+        <w:rPr>
+          <w:rFonts w:cstheme="minorHAnsi"/>
+        </w:rPr>
+        <w:t xml:space="preserve"> eller lign.) kan du med</w:t>
+      </w:r>
+      <w:r>
+        <w:rPr>
+          <w:rFonts w:cstheme="minorHAnsi"/>
+        </w:rPr>
+        <w:t xml:space="preserve"> </w:t>
+      </w:r>
+      <w:r>
+        <w:rPr>
+          <w:rFonts w:cstheme="minorHAnsi"/>
+        </w:rPr>
+        <w:t>fordel indsætte et link til dit projekt i rapporten.</w:t>
+      </w:r>
+      <w:r>
+        <w:rPr>
+          <w:rFonts w:cstheme="minorHAnsi"/>
+        </w:rPr>
+        <w:t xml:space="preserve"> Du kan også med fordel indsætte daglige screenshots af dit </w:t>
+      </w:r>
+      <w:proofErr w:type="spellStart"/>
+      <w:r>
+        <w:rPr>
+          <w:rFonts w:cstheme="minorHAnsi"/>
+        </w:rPr>
+        <w:t>github</w:t>
+      </w:r>
+      <w:proofErr w:type="spellEnd"/>
+      <w:r>
+        <w:rPr>
+          <w:rFonts w:cstheme="minorHAnsi"/>
+        </w:rPr>
+        <w:t xml:space="preserve"> </w:t>
+      </w:r>
+      <w:proofErr w:type="spellStart"/>
+      <w:r>
+        <w:rPr>
+          <w:rFonts w:cstheme="minorHAnsi"/>
+        </w:rPr>
+        <w:t>projects</w:t>
+      </w:r>
+      <w:proofErr w:type="spellEnd"/>
+      <w:r>
+        <w:rPr>
+          <w:rFonts w:cstheme="minorHAnsi"/>
+        </w:rPr>
+        <w:t xml:space="preserve"> eller </w:t>
+      </w:r>
+      <w:proofErr w:type="spellStart"/>
+      <w:r>
+        <w:rPr>
+          <w:rFonts w:cstheme="minorHAnsi"/>
+        </w:rPr>
+        <w:t>trello</w:t>
+      </w:r>
+      <w:proofErr w:type="spellEnd"/>
+      <w:r>
+        <w:rPr>
+          <w:rFonts w:cstheme="minorHAnsi"/>
+        </w:rPr>
+        <w:t>-board, som kan vise din progression i arbejdet.</w:t>
+      </w:r>
+    </w:p>
+    <w:p>
+      <w:pPr>
+        <w:pStyle w:val="Overskrift3"/>
+      </w:pPr>
+      <w:r>
+        <w:t>Øverst i</w:t>
+      </w:r>
+      <w:r>
+        <w:t xml:space="preserve"> rapporten skal fremgå:</w:t>
       </w:r>
     </w:p>
     <w:p>
@@ -863,44 +844,8 @@
         <w:rPr>
           <w:rFonts w:cstheme="minorHAnsi"/>
         </w:rPr>
-        <w:t xml:space="preserve">URL til </w:t>
-      </w:r>
-      <w:proofErr w:type="spellStart"/>
-      <w:r>
-        <w:rPr>
-          <w:rFonts w:cstheme="minorHAnsi"/>
-        </w:rPr>
-        <w:t>GitHub</w:t>
-      </w:r>
-      <w:proofErr w:type="spellEnd"/>
-      <w:r>
-        <w:rPr>
-          <w:rFonts w:cstheme="minorHAnsi"/>
-        </w:rPr>
-        <w:t xml:space="preserve"> </w:t>
-      </w:r>
-      <w:proofErr w:type="spellStart"/>
-      <w:r>
-        <w:rPr>
-          <w:rFonts w:cstheme="minorHAnsi"/>
-        </w:rPr>
-        <w:t>repository</w:t>
-      </w:r>
-      <w:proofErr w:type="spellEnd"/>
-      <w:r>
-        <w:rPr>
-          <w:rFonts w:cstheme="minorHAnsi"/>
-        </w:rPr>
-        <w:t xml:space="preserve"> samt </w:t>
-      </w:r>
-      <w:proofErr w:type="spellStart"/>
-      <w:r>
-        <w:rPr>
-          <w:rFonts w:cstheme="minorHAnsi"/>
-        </w:rPr>
-        <w:t>netlify</w:t>
-      </w:r>
-      <w:proofErr w:type="spellEnd"/>
+        <w:t>Opgavens navn samt dit navn og holdnummer</w:t>
+      </w:r>
     </w:p>
     <w:p>
       <w:pPr>
@@ -917,6 +862,46 @@
         <w:rPr>
           <w:rFonts w:cstheme="minorHAnsi"/>
         </w:rPr>
+        <w:t xml:space="preserve">URL til GitHub </w:t>
+      </w:r>
+      <w:proofErr w:type="spellStart"/>
+      <w:r>
+        <w:rPr>
+          <w:rFonts w:cstheme="minorHAnsi"/>
+        </w:rPr>
+        <w:t>repository</w:t>
+      </w:r>
+      <w:proofErr w:type="spellEnd"/>
+      <w:r>
+        <w:rPr>
+          <w:rFonts w:cstheme="minorHAnsi"/>
+        </w:rPr>
+        <w:t xml:space="preserve"> samt </w:t>
+      </w:r>
+      <w:proofErr w:type="spellStart"/>
+      <w:r>
+        <w:rPr>
+          <w:rFonts w:cstheme="minorHAnsi"/>
+        </w:rPr>
+        <w:t>netlify</w:t>
+      </w:r>
+      <w:proofErr w:type="spellEnd"/>
+    </w:p>
+    <w:p>
+      <w:pPr>
+        <w:pStyle w:val="Listeafsnit"/>
+        <w:numPr>
+          <w:ilvl w:val="0"/>
+          <w:numId w:val="3"/>
+        </w:numPr>
+        <w:rPr>
+          <w:rFonts w:cstheme="minorHAnsi"/>
+        </w:rPr>
+      </w:pPr>
+      <w:r>
+        <w:rPr>
+          <w:rFonts w:cstheme="minorHAnsi"/>
+        </w:rPr>
         <w:t>Brugernavn/adgangskoder</w:t>
       </w:r>
     </w:p>
@@ -978,6 +963,7 @@
           <w:iCs/>
           <w:color w:val="000000"/>
         </w:rPr>
+        <w:lastRenderedPageBreak/>
         <w:t>Hvis du oplever elementer i opgaven, som ikke er vist i designet eller nævnt i</w:t>
       </w:r>
       <w:r>
@@ -1343,28 +1329,7 @@
         <w:t xml:space="preserve">Ekstraopgave: </w:t>
       </w:r>
       <w:r>
-        <w:t xml:space="preserve">I stedet for de </w:t>
-      </w:r>
-      <w:r>
-        <w:t>tre</w:t>
-      </w:r>
-      <w:r>
-        <w:t xml:space="preserve"> første </w:t>
-      </w:r>
-      <w:r>
-        <w:t>medarbejdere</w:t>
-      </w:r>
-      <w:r>
-        <w:t xml:space="preserve">, vises </w:t>
-      </w:r>
-      <w:r>
-        <w:t>tre</w:t>
-      </w:r>
-      <w:r>
-        <w:t xml:space="preserve"> tilfældige </w:t>
-      </w:r>
-      <w:r>
-        <w:t>medarbejdere</w:t>
+        <w:t>I stedet for de tre første medarbejdere, vises tre tilfældige medarbejdere</w:t>
       </w:r>
     </w:p>
     <w:p>
@@ -1385,6 +1350,7 @@
         <w:pStyle w:val="Overskrift1"/>
       </w:pPr>
       <w:r>
+        <w:lastRenderedPageBreak/>
         <w:t>Boliger til salg</w:t>
       </w:r>
     </w:p>
@@ -1403,7 +1369,6 @@
     </w:p>
     <w:p>
       <w:r>
-        <w:lastRenderedPageBreak/>
         <w:t>Når en bruger klikker på en bolig vises boligen i detaljevisning.</w:t>
       </w:r>
     </w:p>
@@ -1496,21 +1461,12 @@
       </w:r>
       <w:proofErr w:type="spellEnd"/>
       <w:r>
-        <w:t xml:space="preserve"> – </w:t>
-      </w:r>
-      <w:r>
-        <w:t>plantegning</w:t>
-      </w:r>
-    </w:p>
-    <w:p>
-      <w:r>
-        <w:t xml:space="preserve">Ved klik på </w:t>
-      </w:r>
-      <w:r>
-        <w:t>plantegnings</w:t>
-      </w:r>
-      <w:r>
-        <w:t xml:space="preserve">-ikonet vises et </w:t>
+        <w:t xml:space="preserve"> – plantegning</w:t>
+      </w:r>
+    </w:p>
+    <w:p>
+      <w:r>
+        <w:t xml:space="preserve">Ved klik på plantegnings-ikonet vises et </w:t>
       </w:r>
       <w:proofErr w:type="spellStart"/>
       <w:r>
@@ -1518,10 +1474,7 @@
       </w:r>
       <w:proofErr w:type="spellEnd"/>
       <w:r>
-        <w:t xml:space="preserve"> med </w:t>
-      </w:r>
-      <w:r>
-        <w:t xml:space="preserve">boligens </w:t>
+        <w:t xml:space="preserve"> med boligens </w:t>
       </w:r>
       <w:proofErr w:type="spellStart"/>
       <w:r>
@@ -1529,10 +1482,7 @@
       </w:r>
       <w:proofErr w:type="spellEnd"/>
       <w:r>
-        <w:t>.</w:t>
-      </w:r>
-      <w:r>
-        <w:t xml:space="preserve"> </w:t>
+        <w:t xml:space="preserve">. </w:t>
       </w:r>
     </w:p>
     <w:p>
@@ -1545,21 +1495,12 @@
       </w:r>
       <w:proofErr w:type="spellEnd"/>
       <w:r>
-        <w:t xml:space="preserve"> – </w:t>
-      </w:r>
-      <w:r>
-        <w:t>kort</w:t>
-      </w:r>
-    </w:p>
-    <w:p>
-      <w:r>
-        <w:t xml:space="preserve">Ved klik på </w:t>
-      </w:r>
-      <w:r>
-        <w:t>pin</w:t>
-      </w:r>
-      <w:r>
-        <w:t xml:space="preserve">-ikonet vises et </w:t>
+        <w:t xml:space="preserve"> – kort</w:t>
+      </w:r>
+    </w:p>
+    <w:p>
+      <w:r>
+        <w:t xml:space="preserve">Ved klik på pin-ikonet vises et </w:t>
       </w:r>
       <w:proofErr w:type="spellStart"/>
       <w:r>
@@ -1567,16 +1508,7 @@
       </w:r>
       <w:proofErr w:type="spellEnd"/>
       <w:r>
-        <w:t xml:space="preserve"> med boligens </w:t>
-      </w:r>
-      <w:r>
-        <w:t>placering på et kort</w:t>
-      </w:r>
-      <w:r>
-        <w:t>.</w:t>
-      </w:r>
-      <w:r>
-        <w:t xml:space="preserve"> Det er OK at bruge et statisk billede.</w:t>
+        <w:t xml:space="preserve"> med boligens placering på et kort. Det er OK at bruge et statisk billede.</w:t>
       </w:r>
       <w:r>
         <w:br/>
@@ -1596,10 +1528,7 @@
       </w:r>
       <w:proofErr w:type="spellEnd"/>
       <w:r>
-        <w:t xml:space="preserve"> og long properties til at vise boligens placering på et rigtigt kort. (OBS: koordinaterne der er tastet ind på boligerne er i det generelle område som boligens fiktive adresse ligger i). </w:t>
-      </w:r>
-      <w:r>
-        <w:t xml:space="preserve"> </w:t>
+        <w:t xml:space="preserve"> og long properties til at vise boligens placering på et rigtigt kort. (OBS: koordinaterne der er tastet ind på boligerne er i det generelle område som boligens fiktive adresse ligger i).  </w:t>
       </w:r>
     </w:p>
     <w:p>
@@ -1640,6 +1569,7 @@
         <w:pStyle w:val="Overskrift1"/>
       </w:pPr>
       <w:r>
+        <w:lastRenderedPageBreak/>
         <w:t>Medarbejdere</w:t>
       </w:r>
     </w:p>
@@ -1656,7 +1586,6 @@
         <w:pStyle w:val="Overskrift1"/>
       </w:pPr>
       <w:r>
-        <w:lastRenderedPageBreak/>
         <w:t>Kontakt en medarbejder (detaljesiden)</w:t>
       </w:r>
     </w:p>
@@ -1691,10 +1620,7 @@
     </w:p>
     <w:p>
       <w:r>
-        <w:t xml:space="preserve">På denne side er det muligt at sende en mail til kontoret. </w:t>
-      </w:r>
-      <w:r>
-        <w:t>Ved tryk på knappen send besked, skal de indtastede data (hvis formularen validerer) vises i loggen.</w:t>
+        <w:t>På denne side er det muligt at sende en mail til kontoret. Ved tryk på knappen send besked, skal de indtastede data (hvis formularen validerer) vises i loggen.</w:t>
       </w:r>
     </w:p>
     <w:p>
@@ -1794,12 +1720,7 @@
       </w:r>
       <w:proofErr w:type="spellEnd"/>
       <w:r>
-        <w:t xml:space="preserve"> skal selvfølgelig være den s</w:t>
-      </w:r>
-      <w:bookmarkStart w:id="0" w:name="_GoBack"/>
-      <w:bookmarkEnd w:id="0"/>
-      <w:r>
-        <w:t xml:space="preserve">amme som på de andre sider. </w:t>
+        <w:t xml:space="preserve"> skal selvfølgelig være den samme som på de andre sider. </w:t>
       </w:r>
     </w:p>
     <w:sectPr>
@@ -1813,7 +1734,7 @@
 </file>
 
 <file path=word/endnotes.xml><?xml version="1.0" encoding="utf-8"?>
-<w:endnotes xmlns:wpc="http://schemas.microsoft.com/office/word/2010/wordprocessingCanvas" xmlns:cx="http://schemas.microsoft.com/office/drawing/2014/chartex" xmlns:cx1="http://schemas.microsoft.com/office/drawing/2015/9/8/chartex" xmlns:mc="http://schemas.openxmlformats.org/markup-compatibility/2006" xmlns:o="urn:schemas-microsoft-com:office:office" xmlns:r="http://schemas.openxmlformats.org/officeDocument/2006/relationships" xmlns:m="http://schemas.openxmlformats.org/officeDocument/2006/math" xmlns:v="urn:schemas-microsoft-com:vml" xmlns:wp14="http://schemas.microsoft.com/office/word/2010/wordprocessingDrawing" xmlns:wp="http://schemas.openxmlformats.org/drawingml/2006/wordprocessingDrawing" xmlns:w10="urn:schemas-microsoft-com:office:word" xmlns:w="http://schemas.openxmlformats.org/wordprocessingml/2006/main" xmlns:w14="http://schemas.microsoft.com/office/word/2010/wordml" xmlns:w15="http://schemas.microsoft.com/office/word/2012/wordml" xmlns:w16se="http://schemas.microsoft.com/office/word/2015/wordml/symex" xmlns:wpg="http://schemas.microsoft.com/office/word/2010/wordprocessingGroup" xmlns:wpi="http://schemas.microsoft.com/office/word/2010/wordprocessingInk" xmlns:wne="http://schemas.microsoft.com/office/word/2006/wordml" xmlns:wps="http://schemas.microsoft.com/office/word/2010/wordprocessingShape" mc:Ignorable="w14 w15 w16se wp14">
+<w:endnotes xmlns:wpc="http://schemas.microsoft.com/office/word/2010/wordprocessingCanvas" xmlns:cx="http://schemas.microsoft.com/office/drawing/2014/chartex" xmlns:cx1="http://schemas.microsoft.com/office/drawing/2015/9/8/chartex" xmlns:cx2="http://schemas.microsoft.com/office/drawing/2015/10/21/chartex" xmlns:cx3="http://schemas.microsoft.com/office/drawing/2016/5/9/chartex" xmlns:cx4="http://schemas.microsoft.com/office/drawing/2016/5/10/chartex" xmlns:cx5="http://schemas.microsoft.com/office/drawing/2016/5/11/chartex" xmlns:cx6="http://schemas.microsoft.com/office/drawing/2016/5/12/chartex" xmlns:cx7="http://schemas.microsoft.com/office/drawing/2016/5/13/chartex" xmlns:cx8="http://schemas.microsoft.com/office/drawing/2016/5/14/chartex" xmlns:mc="http://schemas.openxmlformats.org/markup-compatibility/2006" xmlns:aink="http://schemas.microsoft.com/office/drawing/2016/ink" xmlns:am3d="http://schemas.microsoft.com/office/drawing/2017/model3d" xmlns:o="urn:schemas-microsoft-com:office:office" xmlns:oel="http://schemas.microsoft.com/office/2019/extlst" xmlns:r="http://schemas.openxmlformats.org/officeDocument/2006/relationships" xmlns:m="http://schemas.openxmlformats.org/officeDocument/2006/math" xmlns:v="urn:schemas-microsoft-com:vml" xmlns:wp14="http://schemas.microsoft.com/office/word/2010/wordprocessingDrawing" xmlns:wp="http://schemas.openxmlformats.org/drawingml/2006/wordprocessingDrawing" xmlns:w10="urn:schemas-microsoft-com:office:word" xmlns:w="http://schemas.openxmlformats.org/wordprocessingml/2006/main" xmlns:w14="http://schemas.microsoft.com/office/word/2010/wordml" xmlns:w15="http://schemas.microsoft.com/office/word/2012/wordml" xmlns:w16cex="http://schemas.microsoft.com/office/word/2018/wordml/cex" xmlns:w16cid="http://schemas.microsoft.com/office/word/2016/wordml/cid" xmlns:w16="http://schemas.microsoft.com/office/word/2018/wordml" xmlns:w16du="http://schemas.microsoft.com/office/word/2023/wordml/word16du" xmlns:w16sdtdh="http://schemas.microsoft.com/office/word/2020/wordml/sdtdatahash" xmlns:w16sdtfl="http://schemas.microsoft.com/office/word/2024/wordml/sdtformatlock" xmlns:w16se="http://schemas.microsoft.com/office/word/2015/wordml/symex" xmlns:wpg="http://schemas.microsoft.com/office/word/2010/wordprocessingGroup" xmlns:wpi="http://schemas.microsoft.com/office/word/2010/wordprocessingInk" xmlns:wne="http://schemas.microsoft.com/office/word/2006/wordml" xmlns:wps="http://schemas.microsoft.com/office/word/2010/wordprocessingShape" mc:Ignorable="w14 w15 w16se w16cid w16 w16cex w16sdtdh w16sdtfl w16du wp14">
   <w:endnote w:type="separator" w:id="-1">
     <w:p>
       <w:pPr>
@@ -1838,7 +1759,7 @@
 </file>
 
 <file path=word/footnotes.xml><?xml version="1.0" encoding="utf-8"?>
-<w:footnotes xmlns:wpc="http://schemas.microsoft.com/office/word/2010/wordprocessingCanvas" xmlns:cx="http://schemas.microsoft.com/office/drawing/2014/chartex" xmlns:cx1="http://schemas.microsoft.com/office/drawing/2015/9/8/chartex" xmlns:mc="http://schemas.openxmlformats.org/markup-compatibility/2006" xmlns:o="urn:schemas-microsoft-com:office:office" xmlns:r="http://schemas.openxmlformats.org/officeDocument/2006/relationships" xmlns:m="http://schemas.openxmlformats.org/officeDocument/2006/math" xmlns:v="urn:schemas-microsoft-com:vml" xmlns:wp14="http://schemas.microsoft.com/office/word/2010/wordprocessingDrawing" xmlns:wp="http://schemas.openxmlformats.org/drawingml/2006/wordprocessingDrawing" xmlns:w10="urn:schemas-microsoft-com:office:word" xmlns:w="http://schemas.openxmlformats.org/wordprocessingml/2006/main" xmlns:w14="http://schemas.microsoft.com/office/word/2010/wordml" xmlns:w15="http://schemas.microsoft.com/office/word/2012/wordml" xmlns:w16se="http://schemas.microsoft.com/office/word/2015/wordml/symex" xmlns:wpg="http://schemas.microsoft.com/office/word/2010/wordprocessingGroup" xmlns:wpi="http://schemas.microsoft.com/office/word/2010/wordprocessingInk" xmlns:wne="http://schemas.microsoft.com/office/word/2006/wordml" xmlns:wps="http://schemas.microsoft.com/office/word/2010/wordprocessingShape" mc:Ignorable="w14 w15 w16se wp14">
+<w:footnotes xmlns:wpc="http://schemas.microsoft.com/office/word/2010/wordprocessingCanvas" xmlns:cx="http://schemas.microsoft.com/office/drawing/2014/chartex" xmlns:cx1="http://schemas.microsoft.com/office/drawing/2015/9/8/chartex" xmlns:cx2="http://schemas.microsoft.com/office/drawing/2015/10/21/chartex" xmlns:cx3="http://schemas.microsoft.com/office/drawing/2016/5/9/chartex" xmlns:cx4="http://schemas.microsoft.com/office/drawing/2016/5/10/chartex" xmlns:cx5="http://schemas.microsoft.com/office/drawing/2016/5/11/chartex" xmlns:cx6="http://schemas.microsoft.com/office/drawing/2016/5/12/chartex" xmlns:cx7="http://schemas.microsoft.com/office/drawing/2016/5/13/chartex" xmlns:cx8="http://schemas.microsoft.com/office/drawing/2016/5/14/chartex" xmlns:mc="http://schemas.openxmlformats.org/markup-compatibility/2006" xmlns:aink="http://schemas.microsoft.com/office/drawing/2016/ink" xmlns:am3d="http://schemas.microsoft.com/office/drawing/2017/model3d" xmlns:o="urn:schemas-microsoft-com:office:office" xmlns:oel="http://schemas.microsoft.com/office/2019/extlst" xmlns:r="http://schemas.openxmlformats.org/officeDocument/2006/relationships" xmlns:m="http://schemas.openxmlformats.org/officeDocument/2006/math" xmlns:v="urn:schemas-microsoft-com:vml" xmlns:wp14="http://schemas.microsoft.com/office/word/2010/wordprocessingDrawing" xmlns:wp="http://schemas.openxmlformats.org/drawingml/2006/wordprocessingDrawing" xmlns:w10="urn:schemas-microsoft-com:office:word" xmlns:w="http://schemas.openxmlformats.org/wordprocessingml/2006/main" xmlns:w14="http://schemas.microsoft.com/office/word/2010/wordml" xmlns:w15="http://schemas.microsoft.com/office/word/2012/wordml" xmlns:w16cex="http://schemas.microsoft.com/office/word/2018/wordml/cex" xmlns:w16cid="http://schemas.microsoft.com/office/word/2016/wordml/cid" xmlns:w16="http://schemas.microsoft.com/office/word/2018/wordml" xmlns:w16du="http://schemas.microsoft.com/office/word/2023/wordml/word16du" xmlns:w16sdtdh="http://schemas.microsoft.com/office/word/2020/wordml/sdtdatahash" xmlns:w16sdtfl="http://schemas.microsoft.com/office/word/2024/wordml/sdtformatlock" xmlns:w16se="http://schemas.microsoft.com/office/word/2015/wordml/symex" xmlns:wpg="http://schemas.microsoft.com/office/word/2010/wordprocessingGroup" xmlns:wpi="http://schemas.microsoft.com/office/word/2010/wordprocessingInk" xmlns:wne="http://schemas.microsoft.com/office/word/2006/wordml" xmlns:wps="http://schemas.microsoft.com/office/word/2010/wordprocessingShape" mc:Ignorable="w14 w15 w16se w16cid w16 w16cex w16sdtdh w16sdtfl w16du wp14">
   <w:footnote w:type="separator" w:id="-1">
     <w:p>
       <w:pPr>
@@ -1863,7 +1784,7 @@
 </file>
 
 <file path=word/numbering.xml><?xml version="1.0" encoding="utf-8"?>
-<w:numbering xmlns:wpc="http://schemas.microsoft.com/office/word/2010/wordprocessingCanvas" xmlns:cx="http://schemas.microsoft.com/office/drawing/2014/chartex" xmlns:cx1="http://schemas.microsoft.com/office/drawing/2015/9/8/chartex" xmlns:mc="http://schemas.openxmlformats.org/markup-compatibility/2006" xmlns:o="urn:schemas-microsoft-com:office:office" xmlns:r="http://schemas.openxmlformats.org/officeDocument/2006/relationships" xmlns:m="http://schemas.openxmlformats.org/officeDocument/2006/math" xmlns:v="urn:schemas-microsoft-com:vml" xmlns:wp14="http://schemas.microsoft.com/office/word/2010/wordprocessingDrawing" xmlns:wp="http://schemas.openxmlformats.org/drawingml/2006/wordprocessingDrawing" xmlns:w10="urn:schemas-microsoft-com:office:word" xmlns:w="http://schemas.openxmlformats.org/wordprocessingml/2006/main" xmlns:w14="http://schemas.microsoft.com/office/word/2010/wordml" xmlns:w15="http://schemas.microsoft.com/office/word/2012/wordml" xmlns:w16se="http://schemas.microsoft.com/office/word/2015/wordml/symex" xmlns:wpg="http://schemas.microsoft.com/office/word/2010/wordprocessingGroup" xmlns:wpi="http://schemas.microsoft.com/office/word/2010/wordprocessingInk" xmlns:wne="http://schemas.microsoft.com/office/word/2006/wordml" xmlns:wps="http://schemas.microsoft.com/office/word/2010/wordprocessingShape" mc:Ignorable="w14 w15 w16se wp14">
+<w:numbering xmlns:wpc="http://schemas.microsoft.com/office/word/2010/wordprocessingCanvas" xmlns:cx="http://schemas.microsoft.com/office/drawing/2014/chartex" xmlns:cx1="http://schemas.microsoft.com/office/drawing/2015/9/8/chartex" xmlns:cx2="http://schemas.microsoft.com/office/drawing/2015/10/21/chartex" xmlns:cx3="http://schemas.microsoft.com/office/drawing/2016/5/9/chartex" xmlns:cx4="http://schemas.microsoft.com/office/drawing/2016/5/10/chartex" xmlns:cx5="http://schemas.microsoft.com/office/drawing/2016/5/11/chartex" xmlns:cx6="http://schemas.microsoft.com/office/drawing/2016/5/12/chartex" xmlns:cx7="http://schemas.microsoft.com/office/drawing/2016/5/13/chartex" xmlns:cx8="http://schemas.microsoft.com/office/drawing/2016/5/14/chartex" xmlns:mc="http://schemas.openxmlformats.org/markup-compatibility/2006" xmlns:aink="http://schemas.microsoft.com/office/drawing/2016/ink" xmlns:am3d="http://schemas.microsoft.com/office/drawing/2017/model3d" xmlns:o="urn:schemas-microsoft-com:office:office" xmlns:oel="http://schemas.microsoft.com/office/2019/extlst" xmlns:r="http://schemas.openxmlformats.org/officeDocument/2006/relationships" xmlns:m="http://schemas.openxmlformats.org/officeDocument/2006/math" xmlns:v="urn:schemas-microsoft-com:vml" xmlns:wp14="http://schemas.microsoft.com/office/word/2010/wordprocessingDrawing" xmlns:wp="http://schemas.openxmlformats.org/drawingml/2006/wordprocessingDrawing" xmlns:w10="urn:schemas-microsoft-com:office:word" xmlns:w="http://schemas.openxmlformats.org/wordprocessingml/2006/main" xmlns:w14="http://schemas.microsoft.com/office/word/2010/wordml" xmlns:w15="http://schemas.microsoft.com/office/word/2012/wordml" xmlns:w16cex="http://schemas.microsoft.com/office/word/2018/wordml/cex" xmlns:w16cid="http://schemas.microsoft.com/office/word/2016/wordml/cid" xmlns:w16="http://schemas.microsoft.com/office/word/2018/wordml" xmlns:w16du="http://schemas.microsoft.com/office/word/2023/wordml/word16du" xmlns:w16sdtdh="http://schemas.microsoft.com/office/word/2020/wordml/sdtdatahash" xmlns:w16sdtfl="http://schemas.microsoft.com/office/word/2024/wordml/sdtformatlock" xmlns:w16se="http://schemas.microsoft.com/office/word/2015/wordml/symex" xmlns:wpg="http://schemas.microsoft.com/office/word/2010/wordprocessingGroup" xmlns:wpi="http://schemas.microsoft.com/office/word/2010/wordprocessingInk" xmlns:wne="http://schemas.microsoft.com/office/word/2006/wordml" xmlns:wps="http://schemas.microsoft.com/office/word/2010/wordprocessingShape" mc:Ignorable="w14 w15 w16se w16cid w16 w16cex w16sdtdh w16sdtfl w16du wp14">
   <w:abstractNum w:abstractNumId="0" w15:restartNumberingAfterBreak="0">
     <w:nsid w:val="15D96580"/>
     <w:multiLevelType w:val="hybridMultilevel"/>
@@ -2105,7 +2026,7 @@
         <w:rFonts w:ascii="Calibri" w:eastAsiaTheme="minorHAnsi" w:hAnsi="Calibri" w:cs="Calibri" w:hint="default"/>
       </w:rPr>
     </w:lvl>
-    <w:lvl w:ilvl="1" w:tplc="04060003" w:tentative="1">
+    <w:lvl w:ilvl="1" w:tplc="04060003">
       <w:start w:val="1"/>
       <w:numFmt w:val="bullet"/>
       <w:lvlText w:val="o"/>
@@ -2314,23 +2235,23 @@
       </w:rPr>
     </w:lvl>
   </w:abstractNum>
-  <w:num w:numId="1">
+  <w:num w:numId="1" w16cid:durableId="1066027807">
     <w:abstractNumId w:val="0"/>
   </w:num>
-  <w:num w:numId="2">
+  <w:num w:numId="2" w16cid:durableId="1403529673">
     <w:abstractNumId w:val="1"/>
   </w:num>
-  <w:num w:numId="3">
+  <w:num w:numId="3" w16cid:durableId="1952280081">
     <w:abstractNumId w:val="2"/>
   </w:num>
-  <w:num w:numId="4">
+  <w:num w:numId="4" w16cid:durableId="449205027">
     <w:abstractNumId w:val="3"/>
   </w:num>
 </w:numbering>
 </file>
 
 <file path=word/styles.xml><?xml version="1.0" encoding="utf-8"?>
-<w:styles xmlns:mc="http://schemas.openxmlformats.org/markup-compatibility/2006" xmlns:r="http://schemas.openxmlformats.org/officeDocument/2006/relationships" xmlns:w="http://schemas.openxmlformats.org/wordprocessingml/2006/main" xmlns:w14="http://schemas.microsoft.com/office/word/2010/wordml" xmlns:w15="http://schemas.microsoft.com/office/word/2012/wordml" xmlns:w16se="http://schemas.microsoft.com/office/word/2015/wordml/symex" mc:Ignorable="w14 w15 w16se">
+<w:styles xmlns:mc="http://schemas.openxmlformats.org/markup-compatibility/2006" xmlns:r="http://schemas.openxmlformats.org/officeDocument/2006/relationships" xmlns:w="http://schemas.openxmlformats.org/wordprocessingml/2006/main" xmlns:w14="http://schemas.microsoft.com/office/word/2010/wordml" xmlns:w15="http://schemas.microsoft.com/office/word/2012/wordml" xmlns:w16cex="http://schemas.microsoft.com/office/word/2018/wordml/cex" xmlns:w16cid="http://schemas.microsoft.com/office/word/2016/wordml/cid" xmlns:w16="http://schemas.microsoft.com/office/word/2018/wordml" xmlns:w16du="http://schemas.microsoft.com/office/word/2023/wordml/word16du" xmlns:w16sdtdh="http://schemas.microsoft.com/office/word/2020/wordml/sdtdatahash" xmlns:w16sdtfl="http://schemas.microsoft.com/office/word/2024/wordml/sdtformatlock" xmlns:w16se="http://schemas.microsoft.com/office/word/2015/wordml/symex" mc:Ignorable="w14 w15 w16se w16cid w16 w16cex w16sdtdh w16sdtfl w16du">
   <w:docDefaults>
     <w:rPrDefault>
       <w:rPr>
@@ -2346,7 +2267,7 @@
       </w:pPr>
     </w:pPrDefault>
   </w:docDefaults>
-  <w:latentStyles w:defLockedState="0" w:defUIPriority="99" w:defSemiHidden="0" w:defUnhideWhenUsed="0" w:defQFormat="0" w:count="371">
+  <w:latentStyles w:defLockedState="0" w:defUIPriority="99" w:defSemiHidden="0" w:defUnhideWhenUsed="0" w:defQFormat="0" w:count="376">
     <w:lsdException w:name="Normal" w:uiPriority="0" w:qFormat="1"/>
     <w:lsdException w:name="heading 1" w:uiPriority="9" w:qFormat="1"/>
     <w:lsdException w:name="heading 2" w:semiHidden="1" w:uiPriority="9" w:unhideWhenUsed="1" w:qFormat="1"/>
@@ -2718,6 +2639,11 @@
     <w:lsdException w:name="List Table 5 Dark Accent 6" w:uiPriority="50"/>
     <w:lsdException w:name="List Table 6 Colorful Accent 6" w:uiPriority="51"/>
     <w:lsdException w:name="List Table 7 Colorful Accent 6" w:uiPriority="52"/>
+    <w:lsdException w:name="Mention" w:semiHidden="1" w:unhideWhenUsed="1"/>
+    <w:lsdException w:name="Smart Hyperlink" w:semiHidden="1" w:unhideWhenUsed="1"/>
+    <w:lsdException w:name="Hashtag" w:semiHidden="1" w:unhideWhenUsed="1"/>
+    <w:lsdException w:name="Unresolved Mention" w:semiHidden="1" w:unhideWhenUsed="1"/>
+    <w:lsdException w:name="Smart Link" w:semiHidden="1" w:unhideWhenUsed="1"/>
   </w:latentStyles>
   <w:style w:type="paragraph" w:default="1" w:styleId="Normal">
     <w:name w:val="Normal"/>
@@ -2791,6 +2717,7 @@
   <w:style w:type="character" w:default="1" w:styleId="Standardskrifttypeiafsnit">
     <w:name w:val="Default Paragraph Font"/>
     <w:uiPriority w:val="1"/>
+    <w:semiHidden/>
     <w:unhideWhenUsed/>
   </w:style>
   <w:style w:type="table" w:default="1" w:styleId="Tabel-Normal">
@@ -3173,6 +3100,26 @@
 </file>
 
 <file path=customXml/item1.xml><?xml version="1.0" encoding="utf-8"?>
+<p:properties xmlns:p="http://schemas.microsoft.com/office/2006/metadata/properties" xmlns:xsi="http://www.w3.org/2001/XMLSchema-instance" xmlns:pc="http://schemas.microsoft.com/office/infopath/2007/PartnerControls">
+  <documentManagement>
+    <lcf76f155ced4ddcb4097134ff3c332f xmlns="b8dd3b87-5148-4f00-a795-4b04527bba93">
+      <Terms xmlns="http://schemas.microsoft.com/office/infopath/2007/PartnerControls"/>
+    </lcf76f155ced4ddcb4097134ff3c332f>
+    <TaxCatchAll xmlns="26ff1238-3a6b-4938-a209-cc1357bbdb6b" xsi:nil="true"/>
+  </documentManagement>
+</p:properties>
+</file>
+
+<file path=customXml/item2.xml><?xml version="1.0" encoding="utf-8"?>
+<?mso-contentType ?>
+<FormTemplates xmlns="http://schemas.microsoft.com/sharepoint/v3/contenttype/forms">
+  <Display>DocumentLibraryForm</Display>
+  <Edit>DocumentLibraryForm</Edit>
+  <New>DocumentLibraryForm</New>
+</FormTemplates>
+</file>
+
+<file path=customXml/item3.xml><?xml version="1.0" encoding="utf-8"?>
 <ct:contentTypeSchema xmlns:ct="http://schemas.microsoft.com/office/2006/metadata/contentType" xmlns:ma="http://schemas.microsoft.com/office/2006/metadata/properties/metaAttributes" ct:_="" ma:_="" ma:contentTypeName="Dokument" ma:contentTypeID="0x010100741293687C50874589BCDBD58402A912" ma:contentTypeVersion="17" ma:contentTypeDescription="Opret et nyt dokument." ma:contentTypeScope="" ma:versionID="877d4154f9710cb4fd047dd19376d8f2">
   <xsd:schema xmlns:xsd="http://www.w3.org/2001/XMLSchema" xmlns:xs="http://www.w3.org/2001/XMLSchema" xmlns:p="http://schemas.microsoft.com/office/2006/metadata/properties" xmlns:ns2="b8dd3b87-5148-4f00-a795-4b04527bba93" xmlns:ns3="26ff1238-3a6b-4938-a209-cc1357bbdb6b" targetNamespace="http://schemas.microsoft.com/office/2006/metadata/properties" ma:root="true" ma:fieldsID="5a2b106cddd49ae38d8e594ae3200a61" ns2:_="" ns3:_="">
     <xsd:import namespace="b8dd3b87-5148-4f00-a795-4b04527bba93"/>
@@ -3421,28 +3368,15 @@
 </ct:contentTypeSchema>
 </file>
 
-<file path=customXml/item2.xml><?xml version="1.0" encoding="utf-8"?>
-<?mso-contentType ?>
-<FormTemplates xmlns="http://schemas.microsoft.com/sharepoint/v3/contenttype/forms">
-  <Display>DocumentLibraryForm</Display>
-  <Edit>DocumentLibraryForm</Edit>
-  <New>DocumentLibraryForm</New>
-</FormTemplates>
-</file>
-
-<file path=customXml/item3.xml><?xml version="1.0" encoding="utf-8"?>
-<p:properties xmlns:p="http://schemas.microsoft.com/office/2006/metadata/properties" xmlns:xsi="http://www.w3.org/2001/XMLSchema-instance" xmlns:pc="http://schemas.microsoft.com/office/infopath/2007/PartnerControls">
-  <documentManagement>
-    <lcf76f155ced4ddcb4097134ff3c332f xmlns="b8dd3b87-5148-4f00-a795-4b04527bba93">
-      <Terms xmlns="http://schemas.microsoft.com/office/infopath/2007/PartnerControls"/>
-    </lcf76f155ced4ddcb4097134ff3c332f>
-    <TaxCatchAll xmlns="26ff1238-3a6b-4938-a209-cc1357bbdb6b" xsi:nil="true"/>
-  </documentManagement>
-</p:properties>
-</file>
-
 <file path=customXml/itemProps1.xml><?xml version="1.0" encoding="utf-8"?>
-<ds:datastoreItem xmlns:ds="http://schemas.openxmlformats.org/officeDocument/2006/customXml" ds:itemID="{8820C463-80B0-451A-8540-1D9DB5D3FA16}"/>
+<ds:datastoreItem xmlns:ds="http://schemas.openxmlformats.org/officeDocument/2006/customXml" ds:itemID="{827AAF68-5624-46D0-ABD1-FD0539BD4C7C}">
+  <ds:schemaRefs>
+    <ds:schemaRef ds:uri="http://schemas.microsoft.com/office/2006/metadata/properties"/>
+    <ds:schemaRef ds:uri="http://schemas.microsoft.com/office/infopath/2007/PartnerControls"/>
+    <ds:schemaRef ds:uri="b8dd3b87-5148-4f00-a795-4b04527bba93"/>
+    <ds:schemaRef ds:uri="26ff1238-3a6b-4938-a209-cc1357bbdb6b"/>
+  </ds:schemaRefs>
+</ds:datastoreItem>
 </file>
 
 <file path=customXml/itemProps2.xml><?xml version="1.0" encoding="utf-8"?>
@@ -3454,18 +3388,20 @@
 </file>
 
 <file path=customXml/itemProps3.xml><?xml version="1.0" encoding="utf-8"?>
-<ds:datastoreItem xmlns:ds="http://schemas.openxmlformats.org/officeDocument/2006/customXml" ds:itemID="{827AAF68-5624-46D0-ABD1-FD0539BD4C7C}">
+<ds:datastoreItem xmlns:ds="http://schemas.openxmlformats.org/officeDocument/2006/customXml" ds:itemID="{8820C463-80B0-451A-8540-1D9DB5D3FA16}">
   <ds:schemaRefs>
+    <ds:schemaRef ds:uri="http://schemas.microsoft.com/office/2006/metadata/contentType"/>
+    <ds:schemaRef ds:uri="http://schemas.microsoft.com/office/2006/metadata/properties/metaAttributes"/>
+    <ds:schemaRef ds:uri="http://www.w3.org/2001/XMLSchema"/>
+    <ds:schemaRef ds:uri="http://schemas.microsoft.com/office/2006/metadata/properties"/>
+    <ds:schemaRef ds:uri="b8dd3b87-5148-4f00-a795-4b04527bba93"/>
+    <ds:schemaRef ds:uri="26ff1238-3a6b-4938-a209-cc1357bbdb6b"/>
     <ds:schemaRef ds:uri="http://schemas.microsoft.com/office/2006/documentManagement/types"/>
-    <ds:schemaRef ds:uri="http://schemas.microsoft.com/office/2006/metadata/properties"/>
+    <ds:schemaRef ds:uri="http://schemas.microsoft.com/office/infopath/2007/PartnerControls"/>
+    <ds:schemaRef ds:uri="http://schemas.openxmlformats.org/package/2006/metadata/core-properties"/>
     <ds:schemaRef ds:uri="http://purl.org/dc/elements/1.1/"/>
-    <ds:schemaRef ds:uri="http://purl.org/dc/dcmitype/"/>
-    <ds:schemaRef ds:uri="92580607-dbe0-4944-a791-14d865e1578f"/>
-    <ds:schemaRef ds:uri="http://schemas.microsoft.com/office/infopath/2007/PartnerControls"/>
-    <ds:schemaRef ds:uri="http://www.w3.org/XML/1998/namespace"/>
     <ds:schemaRef ds:uri="http://purl.org/dc/terms/"/>
-    <ds:schemaRef ds:uri="http://schemas.openxmlformats.org/package/2006/metadata/core-properties"/>
-    <ds:schemaRef ds:uri="534bdfbf-9eda-4dd5-a295-cf45b7c2e55d"/>
+    <ds:schemaRef ds:uri="http://schemas.microsoft.com/internal/obd"/>
   </ds:schemaRefs>
 </ds:datastoreItem>
 </file>
</xml_diff>

<commit_message>
fix: devided components on brokers page
Devided in BrokerDetails, BrokerContact, SearchProperty and CallUs.
I added function to search homes in SearchProperty - when clicking search button or enter, it redirects to houses page and filters the homes showed by the search filter
</commit_message>
<xml_diff>
--- a/Opgavebeskrivelse - din mægler.docx
+++ b/Opgavebeskrivelse - din mægler.docx
@@ -3100,26 +3100,6 @@
 </file>
 
 <file path=customXml/item1.xml><?xml version="1.0" encoding="utf-8"?>
-<p:properties xmlns:p="http://schemas.microsoft.com/office/2006/metadata/properties" xmlns:xsi="http://www.w3.org/2001/XMLSchema-instance" xmlns:pc="http://schemas.microsoft.com/office/infopath/2007/PartnerControls">
-  <documentManagement>
-    <lcf76f155ced4ddcb4097134ff3c332f xmlns="b8dd3b87-5148-4f00-a795-4b04527bba93">
-      <Terms xmlns="http://schemas.microsoft.com/office/infopath/2007/PartnerControls"/>
-    </lcf76f155ced4ddcb4097134ff3c332f>
-    <TaxCatchAll xmlns="26ff1238-3a6b-4938-a209-cc1357bbdb6b" xsi:nil="true"/>
-  </documentManagement>
-</p:properties>
-</file>
-
-<file path=customXml/item2.xml><?xml version="1.0" encoding="utf-8"?>
-<?mso-contentType ?>
-<FormTemplates xmlns="http://schemas.microsoft.com/sharepoint/v3/contenttype/forms">
-  <Display>DocumentLibraryForm</Display>
-  <Edit>DocumentLibraryForm</Edit>
-  <New>DocumentLibraryForm</New>
-</FormTemplates>
-</file>
-
-<file path=customXml/item3.xml><?xml version="1.0" encoding="utf-8"?>
 <ct:contentTypeSchema xmlns:ct="http://schemas.microsoft.com/office/2006/metadata/contentType" xmlns:ma="http://schemas.microsoft.com/office/2006/metadata/properties/metaAttributes" ct:_="" ma:_="" ma:contentTypeName="Dokument" ma:contentTypeID="0x010100741293687C50874589BCDBD58402A912" ma:contentTypeVersion="17" ma:contentTypeDescription="Opret et nyt dokument." ma:contentTypeScope="" ma:versionID="877d4154f9710cb4fd047dd19376d8f2">
   <xsd:schema xmlns:xsd="http://www.w3.org/2001/XMLSchema" xmlns:xs="http://www.w3.org/2001/XMLSchema" xmlns:p="http://schemas.microsoft.com/office/2006/metadata/properties" xmlns:ns2="b8dd3b87-5148-4f00-a795-4b04527bba93" xmlns:ns3="26ff1238-3a6b-4938-a209-cc1357bbdb6b" targetNamespace="http://schemas.microsoft.com/office/2006/metadata/properties" ma:root="true" ma:fieldsID="5a2b106cddd49ae38d8e594ae3200a61" ns2:_="" ns3:_="">
     <xsd:import namespace="b8dd3b87-5148-4f00-a795-4b04527bba93"/>
@@ -3368,26 +3348,27 @@
 </ct:contentTypeSchema>
 </file>
 
-<file path=customXml/itemProps1.xml><?xml version="1.0" encoding="utf-8"?>
-<ds:datastoreItem xmlns:ds="http://schemas.openxmlformats.org/officeDocument/2006/customXml" ds:itemID="{827AAF68-5624-46D0-ABD1-FD0539BD4C7C}">
-  <ds:schemaRefs>
-    <ds:schemaRef ds:uri="http://schemas.microsoft.com/office/2006/metadata/properties"/>
-    <ds:schemaRef ds:uri="http://schemas.microsoft.com/office/infopath/2007/PartnerControls"/>
-    <ds:schemaRef ds:uri="b8dd3b87-5148-4f00-a795-4b04527bba93"/>
-    <ds:schemaRef ds:uri="26ff1238-3a6b-4938-a209-cc1357bbdb6b"/>
-  </ds:schemaRefs>
-</ds:datastoreItem>
+<file path=customXml/item2.xml><?xml version="1.0" encoding="utf-8"?>
+<?mso-contentType ?>
+<FormTemplates xmlns="http://schemas.microsoft.com/sharepoint/v3/contenttype/forms">
+  <Display>DocumentLibraryForm</Display>
+  <Edit>DocumentLibraryForm</Edit>
+  <New>DocumentLibraryForm</New>
+</FormTemplates>
 </file>
 
-<file path=customXml/itemProps2.xml><?xml version="1.0" encoding="utf-8"?>
-<ds:datastoreItem xmlns:ds="http://schemas.openxmlformats.org/officeDocument/2006/customXml" ds:itemID="{25376C2E-3B40-4E3F-BCA9-6007915F4128}">
-  <ds:schemaRefs>
-    <ds:schemaRef ds:uri="http://schemas.microsoft.com/sharepoint/v3/contenttype/forms"/>
-  </ds:schemaRefs>
-</ds:datastoreItem>
+<file path=customXml/item3.xml><?xml version="1.0" encoding="utf-8"?>
+<p:properties xmlns:p="http://schemas.microsoft.com/office/2006/metadata/properties" xmlns:xsi="http://www.w3.org/2001/XMLSchema-instance" xmlns:pc="http://schemas.microsoft.com/office/infopath/2007/PartnerControls">
+  <documentManagement>
+    <lcf76f155ced4ddcb4097134ff3c332f xmlns="b8dd3b87-5148-4f00-a795-4b04527bba93">
+      <Terms xmlns="http://schemas.microsoft.com/office/infopath/2007/PartnerControls"/>
+    </lcf76f155ced4ddcb4097134ff3c332f>
+    <TaxCatchAll xmlns="26ff1238-3a6b-4938-a209-cc1357bbdb6b" xsi:nil="true"/>
+  </documentManagement>
+</p:properties>
 </file>
 
-<file path=customXml/itemProps3.xml><?xml version="1.0" encoding="utf-8"?>
+<file path=customXml/itemProps1.xml><?xml version="1.0" encoding="utf-8"?>
 <ds:datastoreItem xmlns:ds="http://schemas.openxmlformats.org/officeDocument/2006/customXml" ds:itemID="{8820C463-80B0-451A-8540-1D9DB5D3FA16}">
   <ds:schemaRefs>
     <ds:schemaRef ds:uri="http://schemas.microsoft.com/office/2006/metadata/contentType"/>
@@ -3404,4 +3385,23 @@
     <ds:schemaRef ds:uri="http://schemas.microsoft.com/internal/obd"/>
   </ds:schemaRefs>
 </ds:datastoreItem>
+</file>
+
+<file path=customXml/itemProps2.xml><?xml version="1.0" encoding="utf-8"?>
+<ds:datastoreItem xmlns:ds="http://schemas.openxmlformats.org/officeDocument/2006/customXml" ds:itemID="{25376C2E-3B40-4E3F-BCA9-6007915F4128}">
+  <ds:schemaRefs>
+    <ds:schemaRef ds:uri="http://schemas.microsoft.com/sharepoint/v3/contenttype/forms"/>
+  </ds:schemaRefs>
+</ds:datastoreItem>
+</file>
+
+<file path=customXml/itemProps3.xml><?xml version="1.0" encoding="utf-8"?>
+<ds:datastoreItem xmlns:ds="http://schemas.openxmlformats.org/officeDocument/2006/customXml" ds:itemID="{827AAF68-5624-46D0-ABD1-FD0539BD4C7C}">
+  <ds:schemaRefs>
+    <ds:schemaRef ds:uri="http://schemas.microsoft.com/office/2006/metadata/properties"/>
+    <ds:schemaRef ds:uri="http://schemas.microsoft.com/office/infopath/2007/PartnerControls"/>
+    <ds:schemaRef ds:uri="b8dd3b87-5148-4f00-a795-4b04527bba93"/>
+    <ds:schemaRef ds:uri="26ff1238-3a6b-4938-a209-cc1357bbdb6b"/>
+  </ds:schemaRefs>
+</ds:datastoreItem>
 </file>
</xml_diff>

<commit_message>
add: ContactForm to Contact page
added minimum validation but plan to implement zod validation next
</commit_message>
<xml_diff>
--- a/Opgavebeskrivelse - din mægler.docx
+++ b/Opgavebeskrivelse - din mægler.docx
@@ -3100,6 +3100,26 @@
 </file>
 
 <file path=customXml/item1.xml><?xml version="1.0" encoding="utf-8"?>
+<p:properties xmlns:p="http://schemas.microsoft.com/office/2006/metadata/properties" xmlns:xsi="http://www.w3.org/2001/XMLSchema-instance" xmlns:pc="http://schemas.microsoft.com/office/infopath/2007/PartnerControls">
+  <documentManagement>
+    <lcf76f155ced4ddcb4097134ff3c332f xmlns="b8dd3b87-5148-4f00-a795-4b04527bba93">
+      <Terms xmlns="http://schemas.microsoft.com/office/infopath/2007/PartnerControls"/>
+    </lcf76f155ced4ddcb4097134ff3c332f>
+    <TaxCatchAll xmlns="26ff1238-3a6b-4938-a209-cc1357bbdb6b" xsi:nil="true"/>
+  </documentManagement>
+</p:properties>
+</file>
+
+<file path=customXml/item2.xml><?xml version="1.0" encoding="utf-8"?>
+<?mso-contentType ?>
+<FormTemplates xmlns="http://schemas.microsoft.com/sharepoint/v3/contenttype/forms">
+  <Display>DocumentLibraryForm</Display>
+  <Edit>DocumentLibraryForm</Edit>
+  <New>DocumentLibraryForm</New>
+</FormTemplates>
+</file>
+
+<file path=customXml/item3.xml><?xml version="1.0" encoding="utf-8"?>
 <ct:contentTypeSchema xmlns:ct="http://schemas.microsoft.com/office/2006/metadata/contentType" xmlns:ma="http://schemas.microsoft.com/office/2006/metadata/properties/metaAttributes" ct:_="" ma:_="" ma:contentTypeName="Dokument" ma:contentTypeID="0x010100741293687C50874589BCDBD58402A912" ma:contentTypeVersion="17" ma:contentTypeDescription="Opret et nyt dokument." ma:contentTypeScope="" ma:versionID="877d4154f9710cb4fd047dd19376d8f2">
   <xsd:schema xmlns:xsd="http://www.w3.org/2001/XMLSchema" xmlns:xs="http://www.w3.org/2001/XMLSchema" xmlns:p="http://schemas.microsoft.com/office/2006/metadata/properties" xmlns:ns2="b8dd3b87-5148-4f00-a795-4b04527bba93" xmlns:ns3="26ff1238-3a6b-4938-a209-cc1357bbdb6b" targetNamespace="http://schemas.microsoft.com/office/2006/metadata/properties" ma:root="true" ma:fieldsID="5a2b106cddd49ae38d8e594ae3200a61" ns2:_="" ns3:_="">
     <xsd:import namespace="b8dd3b87-5148-4f00-a795-4b04527bba93"/>
@@ -3348,27 +3368,26 @@
 </ct:contentTypeSchema>
 </file>
 
-<file path=customXml/item2.xml><?xml version="1.0" encoding="utf-8"?>
-<?mso-contentType ?>
-<FormTemplates xmlns="http://schemas.microsoft.com/sharepoint/v3/contenttype/forms">
-  <Display>DocumentLibraryForm</Display>
-  <Edit>DocumentLibraryForm</Edit>
-  <New>DocumentLibraryForm</New>
-</FormTemplates>
+<file path=customXml/itemProps1.xml><?xml version="1.0" encoding="utf-8"?>
+<ds:datastoreItem xmlns:ds="http://schemas.openxmlformats.org/officeDocument/2006/customXml" ds:itemID="{827AAF68-5624-46D0-ABD1-FD0539BD4C7C}">
+  <ds:schemaRefs>
+    <ds:schemaRef ds:uri="http://schemas.microsoft.com/office/2006/metadata/properties"/>
+    <ds:schemaRef ds:uri="http://schemas.microsoft.com/office/infopath/2007/PartnerControls"/>
+    <ds:schemaRef ds:uri="b8dd3b87-5148-4f00-a795-4b04527bba93"/>
+    <ds:schemaRef ds:uri="26ff1238-3a6b-4938-a209-cc1357bbdb6b"/>
+  </ds:schemaRefs>
+</ds:datastoreItem>
 </file>
 
-<file path=customXml/item3.xml><?xml version="1.0" encoding="utf-8"?>
-<p:properties xmlns:p="http://schemas.microsoft.com/office/2006/metadata/properties" xmlns:xsi="http://www.w3.org/2001/XMLSchema-instance" xmlns:pc="http://schemas.microsoft.com/office/infopath/2007/PartnerControls">
-  <documentManagement>
-    <lcf76f155ced4ddcb4097134ff3c332f xmlns="b8dd3b87-5148-4f00-a795-4b04527bba93">
-      <Terms xmlns="http://schemas.microsoft.com/office/infopath/2007/PartnerControls"/>
-    </lcf76f155ced4ddcb4097134ff3c332f>
-    <TaxCatchAll xmlns="26ff1238-3a6b-4938-a209-cc1357bbdb6b" xsi:nil="true"/>
-  </documentManagement>
-</p:properties>
+<file path=customXml/itemProps2.xml><?xml version="1.0" encoding="utf-8"?>
+<ds:datastoreItem xmlns:ds="http://schemas.openxmlformats.org/officeDocument/2006/customXml" ds:itemID="{25376C2E-3B40-4E3F-BCA9-6007915F4128}">
+  <ds:schemaRefs>
+    <ds:schemaRef ds:uri="http://schemas.microsoft.com/sharepoint/v3/contenttype/forms"/>
+  </ds:schemaRefs>
+</ds:datastoreItem>
 </file>
 
-<file path=customXml/itemProps1.xml><?xml version="1.0" encoding="utf-8"?>
+<file path=customXml/itemProps3.xml><?xml version="1.0" encoding="utf-8"?>
 <ds:datastoreItem xmlns:ds="http://schemas.openxmlformats.org/officeDocument/2006/customXml" ds:itemID="{8820C463-80B0-451A-8540-1D9DB5D3FA16}">
   <ds:schemaRefs>
     <ds:schemaRef ds:uri="http://schemas.microsoft.com/office/2006/metadata/contentType"/>
@@ -3385,23 +3404,4 @@
     <ds:schemaRef ds:uri="http://schemas.microsoft.com/internal/obd"/>
   </ds:schemaRefs>
 </ds:datastoreItem>
-</file>
-
-<file path=customXml/itemProps2.xml><?xml version="1.0" encoding="utf-8"?>
-<ds:datastoreItem xmlns:ds="http://schemas.openxmlformats.org/officeDocument/2006/customXml" ds:itemID="{25376C2E-3B40-4E3F-BCA9-6007915F4128}">
-  <ds:schemaRefs>
-    <ds:schemaRef ds:uri="http://schemas.microsoft.com/sharepoint/v3/contenttype/forms"/>
-  </ds:schemaRefs>
-</ds:datastoreItem>
-</file>
-
-<file path=customXml/itemProps3.xml><?xml version="1.0" encoding="utf-8"?>
-<ds:datastoreItem xmlns:ds="http://schemas.openxmlformats.org/officeDocument/2006/customXml" ds:itemID="{827AAF68-5624-46D0-ABD1-FD0539BD4C7C}">
-  <ds:schemaRefs>
-    <ds:schemaRef ds:uri="http://schemas.microsoft.com/office/2006/metadata/properties"/>
-    <ds:schemaRef ds:uri="http://schemas.microsoft.com/office/infopath/2007/PartnerControls"/>
-    <ds:schemaRef ds:uri="b8dd3b87-5148-4f00-a795-4b04527bba93"/>
-    <ds:schemaRef ds:uri="26ff1238-3a6b-4938-a209-cc1357bbdb6b"/>
-  </ds:schemaRefs>
-</ds:datastoreItem>
 </file>
</xml_diff>